<commit_message>
w8d3 ppt and doc updates
</commit_message>
<xml_diff>
--- a/Week 8/Project 5/Ravenstack_Churn_Prediction.docx
+++ b/Week 8/Project 5/Ravenstack_Churn_Prediction.docx
@@ -158,6 +158,15 @@
     <w:p>
       <w:pPr>
         <w:spacing w:after="480"/>
+        <w:jc w:val="center"/>
+        <w:rPr>
+          <w:color w:val="808080"/>
+        </w:rPr>
+      </w:pPr>
+    </w:p>
+    <w:p>
+      <w:pPr>
+        <w:spacing w:after="480"/>
       </w:pPr>
     </w:p>
     <w:p>
@@ -250,7 +259,13 @@
         <w:spacing w:after="120" w:line="300" w:lineRule="auto"/>
       </w:pPr>
       <w:r>
-        <w:t>Recommendation: run a 6-week pilot. Estimated upfront cost is $8,000 to $12,000, with monthly running costs of $1,300 to $2,700. Total time from kickoff to live alerts is 10 to 14 weeks. If the pilot shows the model can rank at-risk accounts better than a simple rule-based health score, the company moves to a monthly retraining cadence. If not, the company ships the rules and skips the ML model, having spent under $15,000.</w:t>
+        <w:t>Recommendation: run a 6-</w:t>
+      </w:r>
+      <w:r>
+        <w:t>months</w:t>
+      </w:r>
+      <w:r>
+        <w:t xml:space="preserve"> pilot. Estimated upfront cost is $8,000 to $12,000, with monthly running costs of $1,300 to $2,700. If the pilot shows the model can rank at-risk accounts better than a simple rule-based health score, the company moves to a monthly retraining cadence. If not, the company ships the rules and skips the ML model, having spent under $15,000.</w:t>
       </w:r>
     </w:p>
     <w:p>
@@ -333,14 +348,7 @@
           <w:b/>
           <w:bCs/>
         </w:rPr>
-        <w:t>Cleo</w:t>
-      </w:r>
-      <w:r>
-        <w:rPr>
-          <w:b/>
-          <w:bCs/>
-        </w:rPr>
-        <w:t xml:space="preserve"> (CEO): </w:t>
+        <w:t xml:space="preserve">Cleo (CEO): </w:t>
       </w:r>
       <w:r>
         <w:t>wants revenue predictability and a story she can defend to investors. Worried that AI is a black box she can't explain to her own customers.</w:t>
@@ -1506,10 +1514,7 @@
         <w:spacing w:after="120" w:line="300" w:lineRule="auto"/>
       </w:pPr>
       <w:r>
-        <w:t>Cleo</w:t>
-      </w:r>
-      <w:r>
-        <w:t>’s team exported customer data from Ravenstack’s production systems as five linked CSV files covering January 2023 to December 2024.</w:t>
+        <w:t>Cleo’s team exported customer data from Ravenstack’s production systems as five linked CSV files covering January 2023 to December 2024.</w:t>
       </w:r>
     </w:p>
     <w:tbl>
@@ -4923,10 +4928,7 @@
         <w:spacing w:after="120" w:line="300" w:lineRule="auto"/>
       </w:pPr>
       <w:r>
-        <w:t>Cleo</w:t>
-      </w:r>
-      <w:r>
-        <w:t xml:space="preserve"> is right to be skeptical. AI sales pitches in 2026 promise far more than they deliver, especially for small companies. Here's what the evidence supports and what's still hype.</w:t>
+        <w:t>Cleo is right to be skeptical. AI sales pitches in 2026 promise far more than they deliver, especially for small companies. Here's what the evidence supports and what's still hype.</w:t>
       </w:r>
     </w:p>
     <w:p>
@@ -5097,10 +5099,7 @@
         <w:spacing w:after="120" w:line="300" w:lineRule="auto"/>
       </w:pPr>
       <w:r>
-        <w:t>Cleo</w:t>
-      </w:r>
-      <w:r>
-        <w:t xml:space="preserve"> should not buy a vendor platform. She should fund a 6-week internal pilot. Here's the logic:</w:t>
+        <w:t>Cleo should not buy a vendor platform. She should fund a 6-week internal pilot. Here's the logic:</w:t>
       </w:r>
     </w:p>
     <w:p>
@@ -5210,7 +5209,13 @@
         <w:pStyle w:val="Heading3"/>
       </w:pPr>
       <w:r>
-        <w:t>Phase 1: Discovery validation (2 weeks)</w:t>
+        <w:t>Phase 1: Discovery validation (</w:t>
+      </w:r>
+      <w:r>
+        <w:t>4-6</w:t>
+      </w:r>
+      <w:r>
+        <w:t xml:space="preserve"> weeks)</w:t>
       </w:r>
     </w:p>
     <w:p>
@@ -5290,7 +5295,13 @@
         <w:pStyle w:val="Heading3"/>
       </w:pPr>
       <w:r>
-        <w:t>Phase 2: Pilot model (4 weeks)</w:t>
+        <w:t>Phase 2: Pilot model (</w:t>
+      </w:r>
+      <w:r>
+        <w:t>8-12</w:t>
+      </w:r>
+      <w:r>
+        <w:t xml:space="preserve"> weeks)</w:t>
       </w:r>
     </w:p>
     <w:p>
@@ -5383,7 +5394,13 @@
         <w:pStyle w:val="Heading3"/>
       </w:pPr>
       <w:r>
-        <w:t>Phase 3: Integration (4 weeks)</w:t>
+        <w:t>Phase 3: Integration (</w:t>
+      </w:r>
+      <w:r>
+        <w:t>8-12</w:t>
+      </w:r>
+      <w:r>
+        <w:t xml:space="preserve"> weeks)</w:t>
       </w:r>
     </w:p>
     <w:p>
@@ -5529,13 +5546,7 @@
         <w:t xml:space="preserve">Deliverable: </w:t>
       </w:r>
       <w:r>
-        <w:t xml:space="preserve">quarterly review document for </w:t>
-      </w:r>
-      <w:r>
-        <w:t>Cleo</w:t>
-      </w:r>
-      <w:r>
-        <w:t>.</w:t>
+        <w:t>quarterly review document.</w:t>
       </w:r>
     </w:p>
     <w:p>
@@ -6304,22 +6315,6 @@
     </w:tbl>
     <w:p>
       <w:pPr>
-        <w:pStyle w:val="Heading2"/>
-      </w:pPr>
-      <w:r>
-        <w:t>Timeline</w:t>
-      </w:r>
-    </w:p>
-    <w:p>
-      <w:pPr>
-        <w:spacing w:after="120" w:line="300" w:lineRule="auto"/>
-      </w:pPr>
-      <w:r>
-        <w:t>10 to 14 weeks from kickoff to live alerts. Phase 1 takes 2 weeks, Phase 2 takes 4 weeks, Phase 3 takes 4 weeks, with 2 to 4 weeks of buffer for data engineering surprises.</w:t>
-      </w:r>
-    </w:p>
-    <w:p>
-      <w:pPr>
         <w:rPr>
           <w:b/>
           <w:bCs/>
@@ -6351,19 +6346,6 @@
         <w:spacing w:after="80" w:line="300" w:lineRule="auto"/>
       </w:pPr>
       <w:r>
-        <w:t>The company has at least 200 active customers and 30 or more historical churn events. Below that, switch to heuristics.</w:t>
-      </w:r>
-    </w:p>
-    <w:p>
-      <w:pPr>
-        <w:pStyle w:val="ListParagraph"/>
-        <w:numPr>
-          <w:ilvl w:val="0"/>
-          <w:numId w:val="2"/>
-        </w:numPr>
-        <w:spacing w:after="80" w:line="300" w:lineRule="auto"/>
-      </w:pPr>
-      <w:r>
         <w:t>Customer data is centralized enough to extract in 2 weeks. If data sits in 5 different SaaS tools with no shared customer ID, add 2 to 4 weeks.</w:t>
       </w:r>
     </w:p>
@@ -6437,7 +6419,7 @@
         <w:spacing w:after="80" w:line="300" w:lineRule="auto"/>
       </w:pPr>
       <w:r>
-        <w:t>Developer cost estimates use European mid-market rates of $80 to $120 per hour. Adjust for US (multiply by 1.3) or contractor markets.</w:t>
+        <w:t xml:space="preserve">Developer cost estimates use European mid-market rates of $80 to $120 per hour. </w:t>
       </w:r>
     </w:p>
     <w:p>

</xml_diff>